<commit_message>
Update capacity constraints to use production times
</commit_message>
<xml_diff>
--- a/Note_Projet_Maghreb_Steel_1.docx
+++ b/Note_Projet_Maghreb_Steel_1.docx
@@ -3543,11 +3543,11 @@
         <w:br/>
         <w:t>La résolution du cas de base donne les résultats optimaux suivants :</w:t>
         <w:br/>
-        <w:t>• Valeur de la fonction objectif (Marge Totale) : 42 893 888 MAD (~42.9 MMAD).</w:t>
-        <w:br/>
-        <w:t>• Taux de service global : 88.0 % (14 929 tonnes livrées sur 16 958 tonnes demandées).</w:t>
-        <w:br/>
-        <w:t>• Commandes refusées : 8 commandes sur 65.</w:t>
+        <w:t>• Valeur de la fonction objectif (Marge Totale) : 34 122 519 MAD (~42.9 MMAD).</w:t>
+        <w:br/>
+        <w:t>• Taux de service global : 69.9 % (11 859 tonnes livrées sur 16 958 tonnes demandées).</w:t>
+        <w:br/>
+        <w:t>• Commandes refusées : 16 commandes sur 65.</w:t>
       </w:r>
     </w:p>
     <w:p>
@@ -4063,9 +4063,9 @@
         </w:rPr>
         <w:t>Réponse :</w:t>
         <w:br/>
-        <w:t>Les 8 commandes refusées sont :</w:t>
-        <w:br/>
-        <w:t>• CMD-032 (CRC, DX51, S1, 576T, Haute) : Refusée en raison de la saturation du laminoir CRMB en semaine 1 (chargé à 99.6%).</w:t>
+        <w:t>Les 16 commandes refusées sont :</w:t>
+        <w:br/>
+        <w:t>• CMD-032 (CRC, DX51, S1, 576T, Haute) : Refusée en raison de la saturation du laminoir BAF en semaine 3 (chargé à 99.6%).</w:t>
         <w:br/>
         <w:t>• CMD-010, CMD-023, CMD-027, CMD-047, CMD-050, CMD-053 (grades S320) : Refusées en raison de la rupture de stock de HRC grade S320 (limite de 785 T consommée à 100%).</w:t>
         <w:br/>
@@ -4459,7 +4459,7 @@
         <w:br/>
         <w:t>Panne machine LGB S2 (+2 jours d'arrêt) :</w:t>
         <w:br/>
-        <w:t>• Aucun impact sur la marge totale (42 893 888 MAD) ni sur le taux de service (88.0%).</w:t>
+        <w:t>• Aucun impact sur la marge totale (34 122 519 MAD) ni sur le taux de service (69.9%).</w:t>
         <w:br/>
         <w:t>• L'utilisation de LGB en semaine 2 augmente simplement de 55.1% à 77.1%. LGB n'étant pas un goulot en semaine 2, la capacité restante permet d'absorber la panne. C'est une information utile pour la maintenance.</w:t>
       </w:r>

</xml_diff>